<commit_message>
feat(sales): rename products and group by verification/optimization
Rename catalog titles and routes to Self-Service Skill Check, Self-Service Take-Home, and Learning Loop with legacy redirects. Group the sales index under Verification Products and Optimization Product.
</commit_message>
<xml_diff>
--- a/docs/sales/early-self-service-screening.docx
+++ b/docs/sales/early-self-service-screening.docx
@@ -16,7 +16,7 @@
           <w:sz w:val="32"/>
           <w:szCs w:val="32"/>
         </w:rPr>
-        <w:t xml:space="preserve">Early Self-Service Screening</w:t>
+        <w:t xml:space="preserve">Self-Service Skill Check</w:t>
       </w:r>
     </w:p>
     <w:p>
@@ -1612,7 +1612,7 @@
                 <w:sz w:val="20"/>
                 <w:szCs w:val="20"/>
               </w:rPr>
-              <w:t xml:space="preserve">With Early Self-Service Screening</w:t>
+              <w:t xml:space="preserve">With Self-Service Skill Check</w:t>
             </w:r>
           </w:p>
         </w:tc>

</xml_diff>